<commit_message>
feat(ohioctapp): six folders regenerated on the shared model at HEAD; reply gated on both engines, answering and petition on latex, motion on docx; amicus and opening still reported; open items updated for the second pass (fb-595.54.55)
Co-Authored-By: Claude Opus 5.5 <noreply@anthropic.com>
</commit_message>
<xml_diff>
--- a/courts/sixth-circuit/ohio/state/court-of-appeals/amicus-brief/usage/OUTPUT-amicus-brief.docx
+++ b/courts/sixth-circuit/ohio/state/court-of-appeals/amicus-brief/usage/OUTPUT-amicus-brief.docx
@@ -4442,7 +4442,7 @@
         <w:pStyle w:val="BodyText"/>
       </w:pPr>
       <w:r>
-        <w:t xml:space="preserve">As the trial court put it, the purported identification of the suspect based on face recognition technology search results in this case was “admittedly unreliable.” Tr. at 92. The disclaimer appearing prominently at the bottom of each page of the Clearview AI FRT results provided to the investigating officer warned that “[f]acial recognition search results are to be treated as investigative leads” only and must be “independently verified” through “thorough investigation[].” Def’s Ex. B. As Clearview further warns on its public website, its FRT system is “neither designed, nor intended . . . to be used as a sole source system for conclusively establishing or determining an individual’s identity.” Def’s Ex. C.</w:t>
+        <w:t xml:space="preserve">As the trial court put it, the purported identification of the suspect based on face recognition technology search results in this case was “admittedly unreliable.” Tr. at 92. The disclaimer appearing prominently at the bottom of each page of the Clearview AI FRT results provided to the investigating officer warned that “[f]acial recognition search results are to be treated as investigative leads” only and must be “independently verified” through “thorough investigation[].” Def’s Ex. B. As Clearview further warns on its public website, its FRT system is “neither designed, nor intended . . . to be used as a sole source system for conclusively establishing or determining an individual’s identity.” Def’s Ex. C.</w:t>
       </w:r>
     </w:p>
     <w:p>
@@ -5442,7 +5442,7 @@
         <w:pStyle w:val="BodyText"/>
       </w:pPr>
       <w:r>
-        <w:t xml:space="preserve">Once a defendant demonstrates “by a preponderance of the evidence that the affidavit contains deliberately or recklessly false statements,” the warrant must be suppressed if “the affidavit, without the false statements . . . [no longer] provides the requisite probable cause to sustain the warrant.”</w:t>
+        <w:t xml:space="preserve">Once a defendant demonstrates “by a preponderance of the evidence that the affidavit contains deliberately or recklessly false statements,” the warrant must be suppressed if “the affidavit, without the false statements . . . [no longer] provides the requisite probable cause to sustain the warrant.”</w:t>
       </w:r>
       <w:r>
         <w:t xml:space="preserve"> </w:t>
@@ -5519,7 +5519,7 @@
         <w:pStyle w:val="BodyText"/>
       </w:pPr>
       <w:r>
-        <w:t xml:space="preserve">The claim that the officer “received an identification of the . . . suspect” contains both material omissions and an affirmative false representation.</w:t>
+        <w:t xml:space="preserve">The claim that the officer “received an identification of the . . . suspect” contains both material omissions and an affirmative false representation.</w:t>
       </w:r>
     </w:p>
     <w:p>
@@ -5807,7 +5807,7 @@
         <w:t xml:space="preserve"> </w:t>
       </w:r>
       <w:r>
-        <w:t xml:space="preserve">¶ 49. “A hidden inference should be deemed significant if it can be fairly concluded that it had a substantial bearing on the magistrate’s determination of probable cause in each of two respects:” its “[r]elevance . . . to the magistrate’s inquiry,” and its “[c]omplexity,” meaning that “[t]he more complex and attenuated the logical process by which a relevant conclusion is reached, the more important it is that the magistrate receive an opportunity to test the inference for validity.”</w:t>
+        <w:t xml:space="preserve">¶ 49. “A hidden inference should be deemed significant if it can be fairly concluded that it had a substantial bearing on the magistrate’s determination of probable cause in each of two respects:” its “[r]elevance . . . to the magistrate’s inquiry,” and its “[c]omplexity,” meaning that “[t]he more complex and attenuated the logical process by which a relevant conclusion is reached, the more important it is that the magistrate receive an opportunity to test the inference for validity.”</w:t>
       </w:r>
       <w:r>
         <w:t xml:space="preserve"> </w:t>
@@ -5823,7 +5823,7 @@
         <w:t xml:space="preserve"> </w:t>
       </w:r>
       <w:r>
-        <w:t xml:space="preserve">¶ 49–50. If a hidden inference is deemed “significant,” courts must determine whether the affiant “acted intentionally or with conscious indifference, [in which case] the warrant should be invalidated and the evidence suppressed.”</w:t>
+        <w:t xml:space="preserve">¶ 49–⁠50. If a hidden inference is deemed “significant,” courts must determine whether the affiant “acted intentionally or with conscious indifference, [in which case] the warrant should be invalidated and the evidence suppressed.”</w:t>
       </w:r>
       <w:r>
         <w:t xml:space="preserve"> </w:t>
@@ -7321,7 +7321,7 @@
         <w:t xml:space="preserve"> </w:t>
       </w:r>
       <w:r>
-        <w:t xml:space="preserve">Douglas MacMillan, David Ovalle &amp; Aaron Schaffer, Arrested by AI: Police Ignore Standards After Facial Recognition Matches, Wash. Post (Jan. 13, 2025), https://www.washingtonpost.com/​business/​interactive/2025/​police-artificialintelligence-facial-recognition/.</w:t>
+        <w:t xml:space="preserve">Douglas MacMillan, David Ovalle &amp; Aaron Schaffer, Arrested by AI: Police Ignore Standards After Facial Recognition Matches, Wash. Post (Jan. 13, 2025), https://​www.​washingtonpost.​com/​business/​interactive/​2025/​police-​artificialintelligence-​facial-​recognition/​.</w:t>
       </w:r>
     </w:p>
   </w:footnote>
@@ -7340,7 +7340,7 @@
         <w:t xml:space="preserve"> </w:t>
       </w:r>
       <w:r>
-        <w:t xml:space="preserve">Douglas MacMillan et al., Police Seldom Disclose Use of Facial Recognition Despite False Arrests, Wash. Post (Oct 6, 2024), https://www.washingtonpost.com/​business/2024/10/06/​police-facial-recognitionsecret-false-arrest/ (“Police departments in 15 states provided The Post with rarely seen records documenting their use of facial recognition in more than 1,000 criminal investigations over the past four years. According to the arrest reports in those cases and interviews with people who were arrested, authorities routinely failed to inform defendants about their use of the software …… ”).</w:t>
+        <w:t xml:space="preserve">Douglas MacMillan et al., Police Seldom Disclose Use of Facial Recognition Despite False Arrests, Wash. Post (Oct 6, 2024), https://​www.​washingtonpost.​com/​business/​2024/​10/​06/​police-​facial-​recognitionsecret-​false-​arrest/ (“Police departments in 15 states provided The Post with rarely seen records documenting their use of facial recognition in more than 1,000 criminal investigations over the past four years. According to the arrest reports in those cases and interviews with people who were arrested, authorities routinely failed to inform defendants about their use of the software …… ”).</w:t>
       </w:r>
     </w:p>
   </w:footnote>
@@ -7359,7 +7359,7 @@
         <w:t xml:space="preserve"> </w:t>
       </w:r>
       <w:r>
-        <w:t xml:space="preserve">Jeremy Pelzer, Ohio Continues Facial-Recognition Searches Using Controversial Photo-Collection Firm Clearview AI, cleveland.com (Feb. 21, 2024), https://www.cleveland.com/​news/2024/02/​ohio-continues-facial-recognitionsearches-using-controversial-photo-collection-firm-clearview-ai.html .</w:t>
+        <w:t xml:space="preserve">Jeremy Pelzer, Ohio Continues Facial-Recognition Searches Using Controversial Photo-Collection Firm Clearview AI, cleveland.com (Feb. 21, 2024), https://​www.​cleveland.​com/​news/​2024/​02/​ohio-​continues-​facial-​recognitionsearches-​using-​controversial-​photo-​collection-​firm-​clearview-​ai.​html .</w:t>
       </w:r>
     </w:p>
   </w:footnote>
@@ -7410,7 +7410,7 @@
         <w:t xml:space="preserve"> </w:t>
       </w:r>
       <w:r>
-        <w:t xml:space="preserve">Eyal Press, Does A.I. Lead Police to Ignore Contradictory Evidence, The New Yorker (Nov. 20, 2023), https://www.newyorker.com/​magazine/2023/11/20/​does-a-i-leadpolice-to-ignore-contradictory-evidence/.</w:t>
+        <w:t xml:space="preserve">Eyal Press, Does A.I. Lead Police to Ignore Contradictory Evidence, The New Yorker (Nov. 20, 2023), https://​www.​newyorker.​com/​magazine/​2023/​11/​20/​does-​a-​i-​leadpolice-​to-​ignore-​contradictory-​evidence/​.</w:t>
       </w:r>
     </w:p>
   </w:footnote>
@@ -7429,7 +7429,7 @@
         <w:t xml:space="preserve"> </w:t>
       </w:r>
       <w:r>
-        <w:t xml:space="preserve">See Patrick Grother et al., Face Recognition Vendor Test (FRVT) Part 3: Demographic Effects 5, Nat’l Inst. of Standards &amp; Tech. (2019), https://perma.cc/7L99-A2QJ.</w:t>
+        <w:t xml:space="preserve">See Patrick Grother et al., Face Recognition Vendor Test (FRVT) Part 3: Demographic Effects 5, Nat’l Inst. of Standards &amp; Tech. (2019), https://​perma.​cc/​7L99-​A2QJ.</w:t>
       </w:r>
     </w:p>
   </w:footnote>
@@ -7448,7 +7448,7 @@
         <w:t xml:space="preserve"> </w:t>
       </w:r>
       <w:r>
-        <w:t xml:space="preserve">Nat’l Acads. of Scis., Eng’g, &amp; Med., Facial Recognition Technology: Current Capabilities, Future Prospects, and Governance 53 (2024) [hereinafter “National Academies Report”], https://nap.nationalacademies.org/​catalog/27397/​facialrecognition-technology-current-capabilities-future-prospects-and-governance.</w:t>
+        <w:t xml:space="preserve">Nat’l Acads. of Scis., Eng’g, &amp; Med., Facial Recognition Technology: Current Capabilities, Future Prospects, and Governance 53 (2024) [hereinafter “National Academies Report”], https://​nap.​nationalacademies.​org/​catalog/​27397/​facialrecognition-​technology-​current-​capabilities-​future-​prospects-​and-​governance.</w:t>
       </w:r>
     </w:p>
   </w:footnote>
@@ -7467,7 +7467,7 @@
         <w:t xml:space="preserve"> </w:t>
       </w:r>
       <w:r>
-        <w:t xml:space="preserve">Clearview AI, Company Overview, https://www.clearview.ai/​overview.</w:t>
+        <w:t xml:space="preserve">Clearview AI, Company Overview, https://​www.​clearview.​ai/​overview.</w:t>
       </w:r>
     </w:p>
   </w:footnote>
@@ -7486,7 +7486,7 @@
         <w:t xml:space="preserve"> </w:t>
       </w:r>
       <w:r>
-        <w:t xml:space="preserve">Jason Koebler, Detroit Police Chief: Facial Recognition Software Misidentifies 96% of the Time, Vice News (June 29, 2020), https://perma.cc/5YVX-PTET.</w:t>
+        <w:t xml:space="preserve">Jason Koebler, Detroit Police Chief: Facial Recognition Software Misidentifies 96% of the Time, Vice News (June 29, 2020), https://​perma.​cc/​5YVX-​PTET.</w:t>
       </w:r>
     </w:p>
   </w:footnote>
@@ -7505,7 +7505,7 @@
         <w:t xml:space="preserve"> </w:t>
       </w:r>
       <w:r>
-        <w:t xml:space="preserve">Ohio Atty Gen. Facial Recognition Task Force, Report &amp; Recommendations 10 (Jan. 26, 2020), https://perma.cc/​H4NF-ANNU .</w:t>
+        <w:t xml:space="preserve">Ohio Atty Gen. Facial Recognition Task Force, Report &amp; Recommendations 10 (Jan. 26, 2020), https://​perma.​cc/​H4NF-​ANNU .</w:t>
       </w:r>
     </w:p>
   </w:footnote>
@@ -7524,13 +7524,13 @@
         <w:t xml:space="preserve"> </w:t>
       </w:r>
       <w:r>
-        <w:t xml:space="preserve">See, e.g., Patrick Grother et al., Face Recognition Vendor Test (FRVT) Part 2: Identification 9–10, Nat’l Inst. Standards &amp; Tech. (2019), https://perma.cc/​BR6Y6X6D; U.S. Dep’t of Homeland Sec., DHS/​ICE/​PIA</w:t>
+        <w:t xml:space="preserve">See, e.g., Patrick Grother et al., Face Recognition Vendor Test (FRVT) Part 2: Identification 9–10, Nat’l Inst. Standards &amp; Tech. (2019), https://​perma.​cc/​BR6Y6X6D; U.S. Dep’t of Homeland Sec., DHS/​ICE/​PIA</w:t>
       </w:r>
       <w:r>
         <w:noBreakHyphen/>
       </w:r>
       <w:r>
-        <w:t xml:space="preserve">054, Privacy Impact Assessment for the ICE Use of Facial Recognition Services 26 (2020), https://perma.cc/2TMVJMGH.</w:t>
+        <w:t xml:space="preserve">054, Privacy Impact Assessment for the ICE Use of Facial Recognition Services 26 (2020), https://​perma.​cc/​2TMVJMGH.</w:t>
       </w:r>
     </w:p>
   </w:footnote>
@@ -7549,7 +7549,7 @@
         <w:t xml:space="preserve"> </w:t>
       </w:r>
       <w:r>
-        <w:t xml:space="preserve">See, e.g., Aman Bhatta et al., Impact of Blur and Resolution on Demographic Disparities in 1-to-Many Facial Identification, Proc. of the IEEE/​CVF Winter Conf. on Applications of Comput. Vision (WACV) Workshops 412–20 (2024), https://perma.cc/​MCQ3-QV5V.</w:t>
+        <w:t xml:space="preserve">See, e.g., Aman Bhatta et al., Impact of Blur and Resolution on Demographic Disparities in 1-to-Many Facial Identification, Proc. of the IEEE/​CVF Winter Conf. on Applications of Comput. Vision (WACV) Workshops 412–20 (2024), https://​perma.​cc/​MCQ3-​QV5V.</w:t>
       </w:r>
     </w:p>
   </w:footnote>
@@ -7625,7 +7625,7 @@
         <w:t xml:space="preserve"> </w:t>
       </w:r>
       <w:r>
-        <w:t xml:space="preserve">See, e.g., National Academies Report, supra note 6, at 55–57; Grother, supra note 8, at 7–8; K.S. Krishnapriya et al., Issues Related to Face Recognition Accuracy Varying Based on Race and Skin Tone, 1 IEEE Transactions on Tech. &amp; Soc’y 8, 8–20 (2020), https://ieeexplore.ieee.org/​document/9001031.</w:t>
+        <w:t xml:space="preserve">See, e.g., National Academies Report, supra note 6, at 55–57; Grother, supra note 8, at 7–8; K.S. Krishnapriya et al., Issues Related to Face Recognition Accuracy Varying Based on Race and Skin Tone, 1 IEEE Transactions on Tech. &amp; Soc’y 8, 8–20 (2020), https://​ieeexplore.​ieee.​org/​document/​9001031.</w:t>
       </w:r>
     </w:p>
   </w:footnote>
@@ -7644,7 +7644,7 @@
         <w:t xml:space="preserve"> </w:t>
       </w:r>
       <w:r>
-        <w:t xml:space="preserve">Khari Johnson, The Hidden Role of Facial Recognition Tech in Many Arrests, Wired (Mar. 7, 2022), https://perma.cc/​ECB6-LM22.</w:t>
+        <w:t xml:space="preserve">Khari Johnson, The Hidden Role of Facial Recognition Tech in Many Arrests, Wired (Mar. 7, 2022), https://​perma.​cc/​ECB6-​LM22.</w:t>
       </w:r>
     </w:p>
   </w:footnote>
@@ -7663,7 +7663,7 @@
         <w:t xml:space="preserve"> </w:t>
       </w:r>
       <w:r>
-        <w:t xml:space="preserve">Drew Harwell, Federal Study Confirms Racial Bias of Many Facial-Recognition Systems, Casts Doubt on Their Expanding Use, Wash. Post (Dec. 19, 2019), https://www.washingtonpost.com/​technology/2019/12/19/​federal-study-confirmsracial-bias-many-facial-recognition-systems-casts-doubt-their-expanding-use/.</w:t>
+        <w:t xml:space="preserve">Drew Harwell, Federal Study Confirms Racial Bias of Many Facial-Recognition Systems, Casts Doubt on Their Expanding Use, Wash. Post (Dec. 19, 2019), https://​www.​washingtonpost.​com/​technology/​2019/​12/​19/​federal-​study-​confirmsracial-​bias-​many-​facial-​recognition-​systems-​casts-​doubt-​their-​expanding-​use/​.</w:t>
       </w:r>
     </w:p>
   </w:footnote>
@@ -7682,7 +7682,7 @@
         <w:t xml:space="preserve"> </w:t>
       </w:r>
       <w:r>
-        <w:t xml:space="preserve">U.S. Comm’n on Civil Rights, The Civil Rights Implications of the Federal Use of Facial Recognition Technology 24–29 (2024), https://perma.cc/​D4VS</w:t>
+        <w:t xml:space="preserve">U.S. Comm’n on Civil Rights, The Civil Rights Implications of the Federal Use of Facial Recognition Technology 24–29 (2024), https://​perma.​cc/​D4VS</w:t>
       </w:r>
       <w:r>
         <w:noBreakHyphen/>
@@ -7793,7 +7793,7 @@
         <w:t xml:space="preserve"> </w:t>
       </w:r>
       <w:r>
-        <w:t xml:space="preserve">David White et al., Human Oversight of Facial Recognition Technology in Forensic Applications ¶ 5 (U.K. Parliament 2021), https://committees.parliament.uk/​writtenevidence/38555/​html/.</w:t>
+        <w:t xml:space="preserve">David White et al., Human Oversight of Facial Recognition Technology in Forensic Applications ¶ 5 (U.K. Parliament 2021), https://​committees.​parliament.​uk/​writtenevidence/​38555/​html/​.</w:t>
       </w:r>
       <w:r>
         <w:t xml:space="preserve"> </w:t>
@@ -7841,7 +7841,7 @@
         <w:t xml:space="preserve">See, e.g.</w:t>
       </w:r>
       <w:r>
-        <w:t xml:space="preserve">, Lucas Daprile, Northeast Ohio Police Have Access to AI-Powered Facial Recognition. Here’s One of the Area’s First Policies in Using it, cleveland.com (Jan. 29, 2025), https://www.cleveland.com/​news/2025/01/​northeast-ohio-police-have-access-to-ai-powered-facial-recognition-heres-one-of-the-areas-first-policies-in-using-it.html (Northeast Ohio Regional Fusion Center’s FRT policy “says its facial recognition reports are meant only to generate leads and cannot be used as probable cause”); Bureau of Just. Assistance, U.S. Dep’t of Just., Face Recognition Policy Development Template 22 (2017), https://perma.cc/​CWM7</w:t>
+        <w:t xml:space="preserve">, Lucas Daprile, Northeast Ohio Police Have Access to AI-Powered Facial Recognition. Here’s One of the Area’s First Policies in Using it, cleveland.com (Jan. 29, 2025), https://​www.​cleveland.​com/​news/​2025/​01/​northeast-​ohio-​police-​have-​access-​to-​ai-​powered-​facial-​recognition-​heres-​one-​of-​the-​areas-​first-​policies-​in-​using-​it.​html (Northeast Ohio Regional Fusion Center’s FRT policy “says its facial recognition reports are meant only to generate leads and cannot be used as probable cause”); Bureau of Just. Assistance, U.S. Dep’t of Just., Face Recognition Policy Development Template 22 (2017), https://​perma.​cc/​CWM7</w:t>
       </w:r>
       <w:r>
         <w:noBreakHyphen/>
@@ -8707,6 +8707,7 @@
     <w:unhideWhenUsed/>
     <w:qFormat/>
     <w:pPr>
+      <w:keepLines/>
       <w:spacing w:before="0" w:after="120" w:line="276" w:lineRule="exact"/>
     </w:pPr>
     <w:rPr>
@@ -8957,6 +8958,33 @@
     <w:pPr>
       <w:spacing w:before="0" w:after="0" w:line="276" w:lineRule="exact"/>
       <w:ind w:left="2160" w:hanging="720"/>
+    </w:pPr>
+  </w:style>
+  <w:style w:type="paragraph" w:customStyle="1" w:styleId="XdQuoteList1">
+    <w:name w:val="Xd Quote List 1"/>
+    <w:basedOn w:val="Normal"/>
+    <w:qFormat/>
+    <w:pPr>
+      <w:spacing w:before="0" w:after="0" w:line="276" w:lineRule="exact"/>
+      <w:ind w:left="1440" w:right="720" w:hanging="720"/>
+    </w:pPr>
+  </w:style>
+  <w:style w:type="paragraph" w:customStyle="1" w:styleId="XdQuoteList2">
+    <w:name w:val="Xd Quote List 2"/>
+    <w:basedOn w:val="Normal"/>
+    <w:qFormat/>
+    <w:pPr>
+      <w:spacing w:before="0" w:after="0" w:line="276" w:lineRule="exact"/>
+      <w:ind w:left="2160" w:right="720" w:hanging="720"/>
+    </w:pPr>
+  </w:style>
+  <w:style w:type="paragraph" w:customStyle="1" w:styleId="XdQuoteList3">
+    <w:name w:val="Xd Quote List 3"/>
+    <w:basedOn w:val="Normal"/>
+    <w:qFormat/>
+    <w:pPr>
+      <w:spacing w:before="0" w:after="0" w:line="276" w:lineRule="exact"/>
+      <w:ind w:left="2880" w:right="720" w:hanging="720"/>
     </w:pPr>
   </w:style>
   <w:style w:type="paragraph" w:customStyle="1" w:styleId="XdList1">

</xml_diff>